<commit_message>
feat: enable analytics and refresh resume
</commit_message>
<xml_diff>
--- a/assets/Brandon_Love_Cybersecurity_Resume.docx
+++ b/assets/Brandon_Love_Cybersecurity_Resume.docx
@@ -40,13 +40,7 @@
     </w:p>
     <w:p>
       <w:r>
-        <w:t>Driven Cybersecurity Analyst with a strong foundation in network defense, log analysis, and incident response. Brings 10 years of leadership and risk-management experience from U.S. Army operations, applying security frameworks and analytical discipline to protect digital assets</w:t>
-      </w:r>
-      <w:r>
-        <w:t>, while currently pursuing (ISC)² Certified in Cybersecurity (CC),</w:t>
-      </w:r>
-      <w:r>
-        <w:t xml:space="preserve"> while gaining hands-on experience through the LetsDefend SOC platform, analyzing live security events and simulated attacks.</w:t>
+        <w:t>Cybersecurity analyst with hands-on experience in security operations, incident response, log analysis, and defensive automation. Brings 12+ years of U.S. Army leadership and operational risk-management experience, applying disciplined investigation, clear documentation, and repeatable workflows across Microsoft Sentinel, Defender, Wazuh, Windows telemetry, and network evidence.</w:t>
       </w:r>
     </w:p>
     <w:p>
@@ -119,12 +113,17 @@
     <w:p>
       <w:pPr>
         <w:pStyle w:val="Heading2"/>
+        <w:keepNext/>
+        <w:pageBreakBefore/>
       </w:pPr>
       <w:r>
         <w:t>Professional Experience</w:t>
       </w:r>
     </w:p>
     <w:p>
+      <w:pPr>
+        <w:keepNext/>
+      </w:pPr>
       <w:r>
         <w:t>U.S. Army Reserves – Bryan, TX</w:t>
       </w:r>
@@ -134,6 +133,9 @@
       </w:r>
     </w:p>
     <w:p>
+      <w:pPr>
+        <w:keepLines/>
+      </w:pPr>
       <w:r>
         <w:t>• Directed secure 24/7 mission operations and convoy tracking using encrypted communication systems, ensuring data confidentiality, integrity, and availability.</w:t>
       </w:r>
@@ -154,6 +156,9 @@
       </w:r>
     </w:p>
     <w:p>
+      <w:pPr>
+        <w:keepNext/>
+      </w:pPr>
       <w:r>
         <w:t>AKIMA LLC – Fort Hood, TX</w:t>
       </w:r>
@@ -163,6 +168,9 @@
       </w:r>
     </w:p>
     <w:p>
+      <w:pPr>
+        <w:keepLines/>
+      </w:pPr>
       <w:r>
         <w:t>• Managed sensitive ammunition and equipment transport operations while ensuring secure documentation and chain-of-custody integrity.</w:t>
       </w:r>
@@ -178,17 +186,24 @@
     <w:p>
       <w:pPr>
         <w:pStyle w:val="Heading2"/>
+        <w:keepNext/>
       </w:pPr>
       <w:r>
         <w:t>Projects</w:t>
       </w:r>
     </w:p>
     <w:p>
+      <w:pPr>
+        <w:keepNext/>
+      </w:pPr>
       <w:r>
         <w:t>Live SOC Monitoring – LetsDefend (Oct 2025) | View Profile: https://app.letsdefend.io/user/shinyhunter</w:t>
       </w:r>
     </w:p>
     <w:p>
+      <w:pPr>
+        <w:keepLines/>
+      </w:pPr>
       <w:r>
         <w:t>• Investigated real-time alerts in a simulated SOC using SIEM tools and attack-detection frameworks.</w:t>
       </w:r>
@@ -202,11 +217,17 @@
       </w:r>
     </w:p>
     <w:p>
+      <w:pPr>
+        <w:keepNext/>
+      </w:pPr>
       <w:r>
         <w:t>Leadership in Operational Security – U.S. Army (2024)</w:t>
       </w:r>
     </w:p>
     <w:p>
+      <w:pPr>
+        <w:keepLines/>
+      </w:pPr>
       <w:r>
         <w:t>• Directed a 12-person team under high-pressure conditions, balancing mission objectives with secure communications and data handling protocols.</w:t>
       </w:r>
@@ -214,12 +235,16 @@
     <w:p>
       <w:pPr>
         <w:pStyle w:val="Heading2"/>
+        <w:keepNext/>
       </w:pPr>
       <w:r>
         <w:t>Additional Highlights</w:t>
       </w:r>
     </w:p>
     <w:p>
+      <w:pPr>
+        <w:keepLines/>
+      </w:pPr>
       <w:r>
         <w:t xml:space="preserve">• Security Clearance </w:t>
       </w:r>
@@ -235,6 +260,12 @@
       </w:r>
     </w:p>
     <w:sectPr>
+      <w:headerReference w:type="default" r:id="rId8"/>
+      <w:footerReference w:type="default" r:id="rId9"/>
+      <w:headerReference w:type="first" r:id="rId10"/>
+      <w:footerReference w:type="first" r:id="rId11"/>
+      <w:headerReference w:type="even" r:id="rId12"/>
+      <w:footerReference w:type="even" r:id="rId13"/>
       <w:pgSz w:w="12240" w:h="15840"/>
       <w:pgMar w:top="1440" w:right="1800" w:bottom="1440" w:left="1800" w:header="720" w:footer="720" w:gutter="0"/>
       <w:cols w:space="720"/>
@@ -242,6 +273,66 @@
     </w:sectPr>
   </w:body>
 </w:document>
+</file>
+
+<file path=word/footer1.xml><?xml version="1.0" encoding="utf-8"?>
+<w:ftr xmlns:m="http://schemas.openxmlformats.org/officeDocument/2006/math" xmlns:mc="http://schemas.openxmlformats.org/markup-compatibility/2006" xmlns:mo="http://schemas.microsoft.com/office/mac/office/2008/main" xmlns:mv="urn:schemas-microsoft-com:mac:vml" xmlns:o="urn:schemas-microsoft-com:office:office" xmlns:r="http://schemas.openxmlformats.org/officeDocument/2006/relationships" xmlns:v="urn:schemas-microsoft-com:vml" xmlns:w10="urn:schemas-microsoft-com:office:word" xmlns:w14="http://schemas.microsoft.com/office/word/2010/wordml" xmlns:w="http://schemas.openxmlformats.org/wordprocessingml/2006/main" xmlns:wne="http://schemas.microsoft.com/office/word/2006/wordml" xmlns:wp14="http://schemas.microsoft.com/office/word/2010/wordprocessingDrawing" xmlns:wp="http://schemas.openxmlformats.org/drawingml/2006/wordprocessingDrawing" xmlns:wpc="http://schemas.microsoft.com/office/word/2010/wordprocessingCanvas" xmlns:wpg="http://schemas.microsoft.com/office/word/2010/wordprocessingGroup" xmlns:wpi="http://schemas.microsoft.com/office/word/2010/wordprocessingInk" xmlns:wps="http://schemas.microsoft.com/office/word/2010/wordprocessingShape" mc:Ignorable="w14 wp14">
+  <w:p>
+    <w:pPr>
+      <w:pStyle w:val="Footer"/>
+    </w:pPr>
+  </w:p>
+</w:ftr>
+</file>
+
+<file path=word/footer2.xml><?xml version="1.0" encoding="utf-8"?>
+<w:ftr xmlns:m="http://schemas.openxmlformats.org/officeDocument/2006/math" xmlns:mc="http://schemas.openxmlformats.org/markup-compatibility/2006" xmlns:mo="http://schemas.microsoft.com/office/mac/office/2008/main" xmlns:mv="urn:schemas-microsoft-com:mac:vml" xmlns:o="urn:schemas-microsoft-com:office:office" xmlns:r="http://schemas.openxmlformats.org/officeDocument/2006/relationships" xmlns:v="urn:schemas-microsoft-com:vml" xmlns:w10="urn:schemas-microsoft-com:office:word" xmlns:w14="http://schemas.microsoft.com/office/word/2010/wordml" xmlns:w="http://schemas.openxmlformats.org/wordprocessingml/2006/main" xmlns:wne="http://schemas.microsoft.com/office/word/2006/wordml" xmlns:wp14="http://schemas.microsoft.com/office/word/2010/wordprocessingDrawing" xmlns:wp="http://schemas.openxmlformats.org/drawingml/2006/wordprocessingDrawing" xmlns:wpc="http://schemas.microsoft.com/office/word/2010/wordprocessingCanvas" xmlns:wpg="http://schemas.microsoft.com/office/word/2010/wordprocessingGroup" xmlns:wpi="http://schemas.microsoft.com/office/word/2010/wordprocessingInk" xmlns:wps="http://schemas.microsoft.com/office/word/2010/wordprocessingShape" mc:Ignorable="w14 wp14">
+  <w:p>
+    <w:pPr>
+      <w:pStyle w:val="Footer"/>
+    </w:pPr>
+  </w:p>
+</w:ftr>
+</file>
+
+<file path=word/footer3.xml><?xml version="1.0" encoding="utf-8"?>
+<w:ftr xmlns:m="http://schemas.openxmlformats.org/officeDocument/2006/math" xmlns:mc="http://schemas.openxmlformats.org/markup-compatibility/2006" xmlns:mo="http://schemas.microsoft.com/office/mac/office/2008/main" xmlns:mv="urn:schemas-microsoft-com:mac:vml" xmlns:o="urn:schemas-microsoft-com:office:office" xmlns:r="http://schemas.openxmlformats.org/officeDocument/2006/relationships" xmlns:v="urn:schemas-microsoft-com:vml" xmlns:w10="urn:schemas-microsoft-com:office:word" xmlns:w14="http://schemas.microsoft.com/office/word/2010/wordml" xmlns:w="http://schemas.openxmlformats.org/wordprocessingml/2006/main" xmlns:wne="http://schemas.microsoft.com/office/word/2006/wordml" xmlns:wp14="http://schemas.microsoft.com/office/word/2010/wordprocessingDrawing" xmlns:wp="http://schemas.openxmlformats.org/drawingml/2006/wordprocessingDrawing" xmlns:wpc="http://schemas.microsoft.com/office/word/2010/wordprocessingCanvas" xmlns:wpg="http://schemas.microsoft.com/office/word/2010/wordprocessingGroup" xmlns:wpi="http://schemas.microsoft.com/office/word/2010/wordprocessingInk" xmlns:wps="http://schemas.microsoft.com/office/word/2010/wordprocessingShape" mc:Ignorable="w14 wp14">
+  <w:p>
+    <w:pPr>
+      <w:pStyle w:val="Footer"/>
+    </w:pPr>
+  </w:p>
+</w:ftr>
+</file>
+
+<file path=word/header1.xml><?xml version="1.0" encoding="utf-8"?>
+<w:hdr xmlns:m="http://schemas.openxmlformats.org/officeDocument/2006/math" xmlns:mc="http://schemas.openxmlformats.org/markup-compatibility/2006" xmlns:mo="http://schemas.microsoft.com/office/mac/office/2008/main" xmlns:mv="urn:schemas-microsoft-com:mac:vml" xmlns:o="urn:schemas-microsoft-com:office:office" xmlns:r="http://schemas.openxmlformats.org/officeDocument/2006/relationships" xmlns:v="urn:schemas-microsoft-com:vml" xmlns:w10="urn:schemas-microsoft-com:office:word" xmlns:w14="http://schemas.microsoft.com/office/word/2010/wordml" xmlns:w="http://schemas.openxmlformats.org/wordprocessingml/2006/main" xmlns:wne="http://schemas.microsoft.com/office/word/2006/wordml" xmlns:wp14="http://schemas.microsoft.com/office/word/2010/wordprocessingDrawing" xmlns:wp="http://schemas.openxmlformats.org/drawingml/2006/wordprocessingDrawing" xmlns:wpc="http://schemas.microsoft.com/office/word/2010/wordprocessingCanvas" xmlns:wpg="http://schemas.microsoft.com/office/word/2010/wordprocessingGroup" xmlns:wpi="http://schemas.microsoft.com/office/word/2010/wordprocessingInk" xmlns:wps="http://schemas.microsoft.com/office/word/2010/wordprocessingShape" mc:Ignorable="w14 wp14">
+  <w:p>
+    <w:pPr>
+      <w:pStyle w:val="Header"/>
+    </w:pPr>
+  </w:p>
+</w:hdr>
+</file>
+
+<file path=word/header2.xml><?xml version="1.0" encoding="utf-8"?>
+<w:hdr xmlns:m="http://schemas.openxmlformats.org/officeDocument/2006/math" xmlns:mc="http://schemas.openxmlformats.org/markup-compatibility/2006" xmlns:mo="http://schemas.microsoft.com/office/mac/office/2008/main" xmlns:mv="urn:schemas-microsoft-com:mac:vml" xmlns:o="urn:schemas-microsoft-com:office:office" xmlns:r="http://schemas.openxmlformats.org/officeDocument/2006/relationships" xmlns:v="urn:schemas-microsoft-com:vml" xmlns:w10="urn:schemas-microsoft-com:office:word" xmlns:w14="http://schemas.microsoft.com/office/word/2010/wordml" xmlns:w="http://schemas.openxmlformats.org/wordprocessingml/2006/main" xmlns:wne="http://schemas.microsoft.com/office/word/2006/wordml" xmlns:wp14="http://schemas.microsoft.com/office/word/2010/wordprocessingDrawing" xmlns:wp="http://schemas.openxmlformats.org/drawingml/2006/wordprocessingDrawing" xmlns:wpc="http://schemas.microsoft.com/office/word/2010/wordprocessingCanvas" xmlns:wpg="http://schemas.microsoft.com/office/word/2010/wordprocessingGroup" xmlns:wpi="http://schemas.microsoft.com/office/word/2010/wordprocessingInk" xmlns:wps="http://schemas.microsoft.com/office/word/2010/wordprocessingShape" mc:Ignorable="w14 wp14">
+  <w:p>
+    <w:pPr>
+      <w:pStyle w:val="Header"/>
+    </w:pPr>
+  </w:p>
+</w:hdr>
+</file>
+
+<file path=word/header3.xml><?xml version="1.0" encoding="utf-8"?>
+<w:hdr xmlns:m="http://schemas.openxmlformats.org/officeDocument/2006/math" xmlns:mc="http://schemas.openxmlformats.org/markup-compatibility/2006" xmlns:mo="http://schemas.microsoft.com/office/mac/office/2008/main" xmlns:mv="urn:schemas-microsoft-com:mac:vml" xmlns:o="urn:schemas-microsoft-com:office:office" xmlns:r="http://schemas.openxmlformats.org/officeDocument/2006/relationships" xmlns:v="urn:schemas-microsoft-com:vml" xmlns:w10="urn:schemas-microsoft-com:office:word" xmlns:w14="http://schemas.microsoft.com/office/word/2010/wordml" xmlns:w="http://schemas.openxmlformats.org/wordprocessingml/2006/main" xmlns:wne="http://schemas.microsoft.com/office/word/2006/wordml" xmlns:wp14="http://schemas.microsoft.com/office/word/2010/wordprocessingDrawing" xmlns:wp="http://schemas.openxmlformats.org/drawingml/2006/wordprocessingDrawing" xmlns:wpc="http://schemas.microsoft.com/office/word/2010/wordprocessingCanvas" xmlns:wpg="http://schemas.microsoft.com/office/word/2010/wordprocessingGroup" xmlns:wpi="http://schemas.microsoft.com/office/word/2010/wordprocessingInk" xmlns:wps="http://schemas.microsoft.com/office/word/2010/wordprocessingShape" mc:Ignorable="w14 wp14">
+  <w:p>
+    <w:pPr>
+      <w:pStyle w:val="Header"/>
+    </w:pPr>
+  </w:p>
+</w:hdr>
 </file>
 
 <file path=word/numbering.xml><?xml version="1.0" encoding="utf-8"?>
@@ -12148,23 +12239,4 @@
   </a:objectDefaults>
   <a:extraClrSchemeLst/>
 </a:theme>
-</file>
-
-<file path=customXml/item1.xml><?xml version="1.0" encoding="utf-8"?>
-<b:Sources xmlns:b="http://schemas.openxmlformats.org/officeDocument/2006/bibliography" xmlns="http://schemas.openxmlformats.org/officeDocument/2006/bibliography" SelectedStyle="/APA.XSL" StyleName="APA"/>
-</file>
-
-<file path=customXml/itemProps1.xml><?xml version="1.0" encoding="utf-8"?>
-<ds:datastoreItem xmlns:ds="http://schemas.openxmlformats.org/officeDocument/2006/customXml" ds:itemID="{EF278816-EC6F-A645-907D-7F25AECB1D4A}">
-  <ds:schemaRefs>
-    <ds:schemaRef ds:uri="http://schemas.openxmlformats.org/officeDocument/2006/bibliography"/>
-    <ds:schemaRef ds:uri="http://www.w3.org/2000/xmlns/"/>
-  </ds:schemaRefs>
-</ds:datastoreItem>
-</file>
-
-<file path=docMetadata/LabelInfo.xml><?xml version="1.0" encoding="utf-8"?>
-<clbl:labelList xmlns:clbl="http://schemas.microsoft.com/office/2020/mipLabelMetadata">
-  <clbl:label id="{554eecc5-e26c-4620-b240-5a8bb326c33d}" enabled="1" method="Privileged" siteId="{fae6d70f-954b-4811-92b6-0530d6f84c43}" contentBits="0" removed="0"/>
-</clbl:labelList>
 </file>
</xml_diff>